<commit_message>
docs(skripsi): integrate empirical cut-off 16th and 2-person workflow rationalization (85% efficiency)
</commit_message>
<xml_diff>
--- a/skripsi/skripsi-lengkap.docx
+++ b/skripsi/skripsi-lengkap.docx
@@ -23487,24 +23487,58 @@
           <w:sz w:val="24"/>
           <w:szCs w:val="24"/>
         </w:rPr>
-        <w:t xml:space="preserve"> gaji serta pentingnya tingkat keamanan informasi. Wawancara juga dilakukan dengan staf Tata Usaha dan bagian Keuangan guna mengidentifikasi kesulitan riil terkait kompleksitas rumus yang digunakan di dalam </w:t>
-      </w:r>
-      <w:r>
-        <w:rPr>
-          <w:rFonts w:ascii="Times New Roman" w:hAnsi="Times New Roman" w:cs="Times New Roman"/>
-          <w:i/>
-          <w:sz w:val="24"/>
-          <w:szCs w:val="24"/>
-        </w:rPr>
-        <w:t xml:space="preserve">file spreadsheet</w:t>
-      </w:r>
-      <w:r>
-        <w:rPr>
-          <w:rFonts w:ascii="Times New Roman" w:hAnsi="Times New Roman" w:cs="Times New Roman"/>
-          <w:sz w:val="24"/>
-          <w:szCs w:val="24"/>
-        </w:rPr>
-        <w:t xml:space="preserve">. Lebih lanjut, peneliti mewawancarai perwakilan guru dan karyawan (GTY/GTT) untuk mengetahui kendala minimnya transparansi rincian gaji, keterlambatan informasi, dan kesulitan mereka ketika hendak meminta riwayat slip gaji bulanan mereka yang pada sistem berjalan belum dapat diakses secara mandiri.</w:t>
+        <w:t xml:space="preserve"> gaji serta pentingnya tingkat keamanan informasi. Peneliti juga mewawancarai secara mendalam Ibu Maria selaku staf keuangan/penggajian yang membeberkan bahwa siklus absensi menerapkan batas penutupan (</w:t>
+      </w:r>
+      <w:r>
+        <w:rPr>
+          <w:rFonts w:ascii="Times New Roman" w:hAnsi="Times New Roman" w:cs="Times New Roman"/>
+          <w:i/>
+          <w:sz w:val="24"/>
+          <w:szCs w:val="24"/>
+        </w:rPr>
+        <w:t xml:space="preserve">cut-off</w:t>
+      </w:r>
+      <w:r>
+        <w:rPr>
+          <w:rFonts w:ascii="Times New Roman" w:hAnsi="Times New Roman" w:cs="Times New Roman"/>
+          <w:sz w:val="24"/>
+          <w:szCs w:val="24"/>
+        </w:rPr>
+        <w:t xml:space="preserve">) per tanggal 16 setiap bulannya (misalnya tanggal 16 Maret s.d. 16 April), di mana proses penghitungan honor jam lebih dan tunjangan selama ini sangat rumit (</w:t>
+      </w:r>
+      <w:r>
+        <w:rPr>
+          <w:rFonts w:ascii="Times New Roman" w:hAnsi="Times New Roman" w:cs="Times New Roman"/>
+          <w:i/>
+          <w:sz w:val="24"/>
+          <w:szCs w:val="24"/>
+        </w:rPr>
+        <w:t xml:space="preserve">tricky</w:t>
+      </w:r>
+      <w:r>
+        <w:rPr>
+          <w:rFonts w:ascii="Times New Roman" w:hAnsi="Times New Roman" w:cs="Times New Roman"/>
+          <w:sz w:val="24"/>
+          <w:szCs w:val="24"/>
+        </w:rPr>
+        <w:t xml:space="preserve">) karena harus dicocokkan satu per satu mengikuti </w:t>
+      </w:r>
+      <w:r>
+        <w:rPr>
+          <w:rFonts w:ascii="Times New Roman" w:hAnsi="Times New Roman" w:cs="Times New Roman"/>
+          <w:i/>
+          <w:sz w:val="24"/>
+          <w:szCs w:val="24"/>
+        </w:rPr>
+        <w:t xml:space="preserve">template</w:t>
+      </w:r>
+      <w:r>
+        <w:rPr>
+          <w:rFonts w:ascii="Times New Roman" w:hAnsi="Times New Roman" w:cs="Times New Roman"/>
+          <w:sz w:val="24"/>
+          <w:szCs w:val="24"/>
+        </w:rPr>
+        <w:t xml:space="preserve"> dinamis dari yayasan pusat ke dalam lembar kerja Microsoft Excel. Wawancara dengan Bapak Rendy (staf tata usaha/absensi) mengonfirmasi kendala fisik dalam memilah rekap absensi guru sebelum diserahkan ke Kepala Sekolah. Lebih lanjut, peneliti mewawancarai perwakilan guru dan karyawan (GTY/GTT) untuk mengetahui kendala minimnya transparansi rincian gaji, keterlambatan informasi, dan kesulitan mereka ketika hendak meminta riwayat slip gaji bulanan mereka yang pada sistem berjalan belum dapat diakses secara mandiri.</w:t>
       </w:r>
     </w:p>
     <w:p>
@@ -25968,7 +26002,74 @@
           <w:sz w:val="24"/>
           <w:szCs w:val="24"/>
         </w:rPr>
-        <w:t xml:space="preserve">Fragmentasi data dalam lima lembar kerja yang berbeda ini menimbulkan berbagai komplikasi operasional. Alur kerja yang berlangsung saat ini memakan waktu yang cukup lama dan melibatkan banyak intervensi manual. Secara spesifik, alur tersebut dimulai ketika petugas absensi, dalam hal ini Bapak Rendy, harus menarik data kehadiran harian dari mesin </w:t>
+        <w:t xml:space="preserve">Fragmentasi data dalam lima lembar kerja yang berbeda ini menimbulkan berbagai komplikasi operasional. Siklus penggajian di SMK PSKD 3 Jakarta menerapkan batas penutupan (</w:t>
+      </w:r>
+      <w:r>
+        <w:rPr>
+          <w:rFonts w:ascii="Times New Roman" w:hAnsi="Times New Roman" w:cs="Times New Roman"/>
+          <w:i/>
+          <w:sz w:val="24"/>
+          <w:szCs w:val="24"/>
+        </w:rPr>
+        <w:t xml:space="preserve">cut-off</w:t>
+      </w:r>
+      <w:r>
+        <w:rPr>
+          <w:rFonts w:ascii="Times New Roman" w:hAnsi="Times New Roman" w:cs="Times New Roman"/>
+          <w:sz w:val="24"/>
+          <w:szCs w:val="24"/>
+        </w:rPr>
+        <w:t xml:space="preserve">) absensi per tanggal 16 setiap bulannya (misalnya periode penggajian April mencakup data kehadiran dari tanggal 16 Maret hingga 16 April). Pada sistem berjalan (</w:t>
+      </w:r>
+      <w:r>
+        <w:rPr>
+          <w:rFonts w:ascii="Times New Roman" w:hAnsi="Times New Roman" w:cs="Times New Roman"/>
+          <w:i/>
+          <w:sz w:val="24"/>
+          <w:szCs w:val="24"/>
+        </w:rPr>
+        <w:t xml:space="preserve">as-is</w:t>
+      </w:r>
+      <w:r>
+        <w:rPr>
+          <w:rFonts w:ascii="Times New Roman" w:hAnsi="Times New Roman" w:cs="Times New Roman"/>
+          <w:sz w:val="24"/>
+          <w:szCs w:val="24"/>
+        </w:rPr>
+        <w:t xml:space="preserve">), proses ini memakan waktu yang cukup lama dan melibatkan tiga orang aktor manusia secara berjenjang. Alur kerja manual tersebut berjalan sebagai berikut:</w:t>
+      </w:r>
+    </w:p>
+    <w:p>
+      <w:pPr>
+        <w:jc w:val="both"/>
+        <w:spacing w:before="40" w:after="80" w:line="360" w:lineRule="auto"/>
+        <w:ind w:firstLine="0"/>
+      </w:pPr>
+      <w:r>
+        <w:rPr>
+          <w:rFonts w:ascii="Times New Roman" w:hAnsi="Times New Roman" w:cs="Times New Roman"/>
+          <w:b/>
+          <w:sz w:val="24"/>
+          <w:szCs w:val="24"/>
+        </w:rPr>
+        <w:t xml:space="preserve">1. </w:t>
+      </w:r>
+      <w:r>
+        <w:rPr>
+          <w:rFonts w:ascii="Times New Roman" w:hAnsi="Times New Roman" w:cs="Times New Roman"/>
+          <w:b/>
+          <w:sz w:val="24"/>
+          <w:szCs w:val="24"/>
+        </w:rPr>
+        <w:t xml:space="preserve">Bapak Rendy (Petugas Absensi)</w:t>
+      </w:r>
+      <w:r>
+        <w:rPr>
+          <w:rFonts w:ascii="Times New Roman" w:hAnsi="Times New Roman" w:cs="Times New Roman"/>
+          <w:sz w:val="24"/>
+          <w:szCs w:val="24"/>
+        </w:rPr>
+        <w:t xml:space="preserve">: Menarik data kehadiran mentah dari mesin </w:t>
       </w:r>
       <w:r>
         <w:rPr>
@@ -25985,7 +26086,7 @@
           <w:sz w:val="24"/>
           <w:szCs w:val="24"/>
         </w:rPr>
-        <w:t xml:space="preserve"> dan memindahkannya secara manual ke dalam sheet </w:t>
+        <w:t xml:space="preserve">, memilah kehadiran guru dan karyawan, lalu merekapitulasi jam hadir dan jam lebih secara manual ke dalam lembar kerja </w:t>
       </w:r>
       <w:r>
         <w:rPr>
@@ -26001,7 +26102,40 @@
           <w:sz w:val="24"/>
           <w:szCs w:val="24"/>
         </w:rPr>
-        <w:t xml:space="preserve">. Setelah proses ini selesai, berkas tersebut diserahkan kepada staf keuangan atau bagian penggajian, yaitu Ibu Maria, yang kemudian bertugas memadukan data jam mengajar dengan data pada sheet </w:t>
+        <w:t xml:space="preserve">.</w:t>
+      </w:r>
+    </w:p>
+    <w:p>
+      <w:pPr>
+        <w:jc w:val="both"/>
+        <w:spacing w:before="40" w:after="80" w:line="360" w:lineRule="auto"/>
+        <w:ind w:firstLine="0"/>
+      </w:pPr>
+      <w:r>
+        <w:rPr>
+          <w:rFonts w:ascii="Times New Roman" w:hAnsi="Times New Roman" w:cs="Times New Roman"/>
+          <w:b/>
+          <w:sz w:val="24"/>
+          <w:szCs w:val="24"/>
+        </w:rPr>
+        <w:t xml:space="preserve">2. </w:t>
+      </w:r>
+      <w:r>
+        <w:rPr>
+          <w:rFonts w:ascii="Times New Roman" w:hAnsi="Times New Roman" w:cs="Times New Roman"/>
+          <w:b/>
+          <w:sz w:val="24"/>
+          <w:szCs w:val="24"/>
+        </w:rPr>
+        <w:t xml:space="preserve">Ibu Maria (Staf Keuangan / Penggajian)</w:t>
+      </w:r>
+      <w:r>
+        <w:rPr>
+          <w:rFonts w:ascii="Times New Roman" w:hAnsi="Times New Roman" w:cs="Times New Roman"/>
+          <w:sz w:val="24"/>
+          <w:szCs w:val="24"/>
+        </w:rPr>
+        <w:t xml:space="preserve">: Menerima berkas rekapitulasi jam mengajar dari Bapak Rendy, kemudian bertugas memadukan jam lebih tersebut dengan rumus-rumus kompleks pada lembar kerja </w:t>
       </w:r>
       <w:r>
         <w:rPr>
@@ -26033,7 +26167,105 @@
           <w:sz w:val="24"/>
           <w:szCs w:val="24"/>
         </w:rPr>
-        <w:t xml:space="preserve">. Selanjutnya, berkas Excel yang telah direkap diserahkan kepada Kepala Sekolah, Bapak Thomas, untuk mendapatkan persetujuan (</w:t>
+        <w:t xml:space="preserve"> (gaji pokok acuan pusat), menghitung potongan pinjaman, hingga menyusun lembar kerja </w:t>
+      </w:r>
+      <w:r>
+        <w:rPr>
+          <w:rFonts w:ascii="Times New Roman" w:hAnsi="Times New Roman" w:cs="Times New Roman"/>
+          <w:sz w:val="24"/>
+          <w:szCs w:val="24"/>
+        </w:rPr>
+        <w:t xml:space="preserve">RECAP</w:t>
+      </w:r>
+      <w:r>
+        <w:rPr>
+          <w:rFonts w:ascii="Times New Roman" w:hAnsi="Times New Roman" w:cs="Times New Roman"/>
+          <w:sz w:val="24"/>
+          <w:szCs w:val="24"/>
+        </w:rPr>
+        <w:t xml:space="preserve"> secara satu per satu (</w:t>
+      </w:r>
+      <w:r>
+        <w:rPr>
+          <w:rFonts w:ascii="Times New Roman" w:hAnsi="Times New Roman" w:cs="Times New Roman"/>
+          <w:i/>
+          <w:sz w:val="24"/>
+          <w:szCs w:val="24"/>
+        </w:rPr>
+        <w:t xml:space="preserve">entry by entry</w:t>
+      </w:r>
+      <w:r>
+        <w:rPr>
+          <w:rFonts w:ascii="Times New Roman" w:hAnsi="Times New Roman" w:cs="Times New Roman"/>
+          <w:sz w:val="24"/>
+          <w:szCs w:val="24"/>
+        </w:rPr>
+        <w:t xml:space="preserve">).</w:t>
+      </w:r>
+    </w:p>
+    <w:p>
+      <w:pPr>
+        <w:jc w:val="both"/>
+        <w:spacing w:before="40" w:after="80" w:line="360" w:lineRule="auto"/>
+        <w:ind w:firstLine="0"/>
+      </w:pPr>
+      <w:r>
+        <w:rPr>
+          <w:rFonts w:ascii="Times New Roman" w:hAnsi="Times New Roman" w:cs="Times New Roman"/>
+          <w:b/>
+          <w:sz w:val="24"/>
+          <w:szCs w:val="24"/>
+        </w:rPr>
+        <w:t xml:space="preserve">3. </w:t>
+      </w:r>
+      <w:r>
+        <w:rPr>
+          <w:rFonts w:ascii="Times New Roman" w:hAnsi="Times New Roman" w:cs="Times New Roman"/>
+          <w:b/>
+          <w:sz w:val="24"/>
+          <w:szCs w:val="24"/>
+        </w:rPr>
+        <w:t xml:space="preserve">Bapak Thomas (Kepala Sekolah)</w:t>
+      </w:r>
+      <w:r>
+        <w:rPr>
+          <w:rFonts w:ascii="Times New Roman" w:hAnsi="Times New Roman" w:cs="Times New Roman"/>
+          <w:sz w:val="24"/>
+          <w:szCs w:val="24"/>
+        </w:rPr>
+        <w:t xml:space="preserve">: Memeriksa lembar kerja </w:t>
+      </w:r>
+      <w:r>
+        <w:rPr>
+          <w:rFonts w:ascii="Times New Roman" w:hAnsi="Times New Roman" w:cs="Times New Roman"/>
+          <w:sz w:val="24"/>
+          <w:szCs w:val="24"/>
+        </w:rPr>
+        <w:t xml:space="preserve">RECAP</w:t>
+      </w:r>
+      <w:r>
+        <w:rPr>
+          <w:rFonts w:ascii="Times New Roman" w:hAnsi="Times New Roman" w:cs="Times New Roman"/>
+          <w:sz w:val="24"/>
+          <w:szCs w:val="24"/>
+        </w:rPr>
+        <w:t xml:space="preserve"> dan </w:t>
+      </w:r>
+      <w:r>
+        <w:rPr>
+          <w:rFonts w:ascii="Times New Roman" w:hAnsi="Times New Roman" w:cs="Times New Roman"/>
+          <w:sz w:val="24"/>
+          <w:szCs w:val="24"/>
+        </w:rPr>
+        <w:t xml:space="preserve">DAFTAR PERMINTAAN PEMBAYARAN</w:t>
+      </w:r>
+      <w:r>
+        <w:rPr>
+          <w:rFonts w:ascii="Times New Roman" w:hAnsi="Times New Roman" w:cs="Times New Roman"/>
+          <w:sz w:val="24"/>
+          <w:szCs w:val="24"/>
+        </w:rPr>
+        <w:t xml:space="preserve"> secara manual di lembaran cetak sebelum menandatangani persetujuan (</w:t>
       </w:r>
       <w:r>
         <w:rPr>
@@ -26050,22 +26282,39 @@
           <w:sz w:val="24"/>
           <w:szCs w:val="24"/>
         </w:rPr>
-        <w:t xml:space="preserve">) secara manual dengan memeriksa angka-angka pada berkas cetak atau layar komputer sebelum akhirnya diserahkan ke bendahara.</w:t>
-      </w:r>
-    </w:p>
-    <w:p>
-      <w:pPr>
-        <w:jc w:val="both"/>
-        <w:spacing w:before="0" w:after="120" w:line="360" w:lineRule="auto"/>
-        <w:ind w:firstLine="709"/>
-      </w:pPr>
-      <w:r>
-        <w:rPr>
-          <w:rFonts w:ascii="Times New Roman" w:hAnsi="Times New Roman" w:cs="Times New Roman"/>
-          <w:sz w:val="24"/>
-          <w:szCs w:val="24"/>
-        </w:rPr>
-        <w:t xml:space="preserve">Permasalahan lainnya adalah ketiadaan sistem peringatan atau notifikasi yang terintegrasi. Hal ini mengakibatkan terhambatnya proses koordinasi antarpetugas. Sebagai contoh, jika staf penggajian lupa mengingatkan Kepala Sekolah bahwa terdapat rekap gaji yang membutuhkan persetujuan, maka proses pencairan gaji akan tertunda. Sebaliknya, staf penggajian tidak akan mengetahui secara langsung apabila Bapak Rendy telah selesai melakukan rekapitulasi jam mengajar kecuali jika ada pemberitahuan secara lisan atau melalui aplikasi pesan singkat (</w:t>
+        <w:t xml:space="preserve">) fisik dan menyerahkannya ke Bendahara untuk pencairan dana.</w:t>
+      </w:r>
+    </w:p>
+    <w:p>
+      <w:pPr>
+        <w:jc w:val="both"/>
+        <w:spacing w:before="0" w:after="120" w:line="360" w:lineRule="auto"/>
+        <w:ind w:firstLine="709"/>
+      </w:pPr>
+      <w:r>
+        <w:rPr>
+          <w:rFonts w:ascii="Times New Roman" w:hAnsi="Times New Roman" w:cs="Times New Roman"/>
+          <w:sz w:val="24"/>
+          <w:szCs w:val="24"/>
+        </w:rPr>
+        <w:t xml:space="preserve">Keterlibatan tiga orang dalam alur berjenjang ini menimbulkan hambatan komunikasi (</w:t>
+      </w:r>
+      <w:r>
+        <w:rPr>
+          <w:rFonts w:ascii="Times New Roman" w:hAnsi="Times New Roman" w:cs="Times New Roman"/>
+          <w:i/>
+          <w:sz w:val="24"/>
+          <w:szCs w:val="24"/>
+        </w:rPr>
+        <w:t xml:space="preserve">bottleneck</w:t>
+      </w:r>
+      <w:r>
+        <w:rPr>
+          <w:rFonts w:ascii="Times New Roman" w:hAnsi="Times New Roman" w:cs="Times New Roman"/>
+          <w:sz w:val="24"/>
+          <w:szCs w:val="24"/>
+        </w:rPr>
+        <w:t xml:space="preserve">) dan memperpanjang durasi kerja hingga memakan waktu 2 sampai 3 hari kerja penuh (~16 s.d. 24 jam kerja) setiap akhir bulan. Ketiadaan sistem peringatan atau notifikasi terintegrasi mengakibatkan jika staf penggajian lupa mengingatkan Kepala Sekolah bahwa terdapat rekap gaji yang membutuhkan persetujuan, maka proses pencairan gaji akan tertunda. Sebaliknya, staf penggajian tidak akan mengetahui secara langsung apabila Bapak Rendy telah selesai melakukan rekapitulasi jam mengajar kecuali jika ada pemberitahuan secara lisan atau melalui aplikasi pesan singkat (</w:t>
       </w:r>
       <w:r>
         <w:rPr>
@@ -26163,24 +26412,24 @@
           <w:sz w:val="24"/>
           <w:szCs w:val="24"/>
         </w:rPr>
-        <w:t xml:space="preserve"> dengan arsitektur pangkalan data terpusat, fitur notifikasi </w:t>
-      </w:r>
-      <w:r>
-        <w:rPr>
-          <w:rFonts w:ascii="Times New Roman" w:hAnsi="Times New Roman" w:cs="Times New Roman"/>
-          <w:i/>
-          <w:sz w:val="24"/>
-          <w:szCs w:val="24"/>
-        </w:rPr>
-        <w:t xml:space="preserve">in-app</w:t>
-      </w:r>
-      <w:r>
-        <w:rPr>
-          <w:rFonts w:ascii="Times New Roman" w:hAnsi="Times New Roman" w:cs="Times New Roman"/>
-          <w:sz w:val="24"/>
-          <w:szCs w:val="24"/>
-        </w:rPr>
-        <w:t xml:space="preserve"> otomatis, dan sistem persetujuan (</w:t>
+        <w:t xml:space="preserve"> dengan arsitektur pangkalan data terpusat, </w:t>
+      </w:r>
+      <w:r>
+        <w:rPr>
+          <w:rFonts w:ascii="Times New Roman" w:hAnsi="Times New Roman" w:cs="Times New Roman"/>
+          <w:i/>
+          <w:sz w:val="24"/>
+          <w:szCs w:val="24"/>
+        </w:rPr>
+        <w:t xml:space="preserve">engine</w:t>
+      </w:r>
+      <w:r>
+        <w:rPr>
+          <w:rFonts w:ascii="Times New Roman" w:hAnsi="Times New Roman" w:cs="Times New Roman"/>
+          <w:sz w:val="24"/>
+          <w:szCs w:val="24"/>
+        </w:rPr>
+        <w:t xml:space="preserve"> kalkulasi otomatis, dan sistem persetujuan (</w:t>
       </w:r>
       <w:r>
         <w:rPr>
@@ -26197,24 +26446,257 @@
           <w:sz w:val="24"/>
           <w:szCs w:val="24"/>
         </w:rPr>
-        <w:t xml:space="preserve">) berjenjang. Sistem ini bertujuan untuk mengeliminasi proses pemindahan data manual, menjamin akurasi perhitungan otomatis berdasarkan komponen yang berlaku, mempercepat alur koordinasi melalui notifikasi </w:t>
-      </w:r>
-      <w:r>
-        <w:rPr>
-          <w:rFonts w:ascii="Times New Roman" w:hAnsi="Times New Roman" w:cs="Times New Roman"/>
-          <w:i/>
-          <w:sz w:val="24"/>
-          <w:szCs w:val="24"/>
-        </w:rPr>
-        <w:t xml:space="preserve">real-time</w:t>
-      </w:r>
-      <w:r>
-        <w:rPr>
-          <w:rFonts w:ascii="Times New Roman" w:hAnsi="Times New Roman" w:cs="Times New Roman"/>
-          <w:sz w:val="24"/>
-          <w:szCs w:val="24"/>
-        </w:rPr>
-        <w:t xml:space="preserve">, serta memberikan transparansi bagi guru dan karyawan melalui akses slip gaji digital secara mandiri.</w:t>
+        <w:t xml:space="preserve">) terdigitalisasi. Melalui sistem ini, peran perantara kalkulasi manual yang sebelumnya dikerjakan oleh Ibu Maria sepenuhnya digantikan oleh mesin sistem (</w:t>
+      </w:r>
+      <w:r>
+        <w:rPr>
+          <w:rFonts w:ascii="Times New Roman" w:hAnsi="Times New Roman" w:cs="Times New Roman"/>
+          <w:i/>
+          <w:sz w:val="24"/>
+          <w:szCs w:val="24"/>
+        </w:rPr>
+        <w:t xml:space="preserve">automated calculation engine</w:t>
+      </w:r>
+      <w:r>
+        <w:rPr>
+          <w:rFonts w:ascii="Times New Roman" w:hAnsi="Times New Roman" w:cs="Times New Roman"/>
+          <w:sz w:val="24"/>
+          <w:szCs w:val="24"/>
+        </w:rPr>
+        <w:t xml:space="preserve">), sehingga keterlibatan aktor manusia berhasil dirampingkan secara optimal menjadi </w:t>
+      </w:r>
+      <w:r>
+        <w:rPr>
+          <w:rFonts w:ascii="Times New Roman" w:hAnsi="Times New Roman" w:cs="Times New Roman"/>
+          <w:b/>
+          <w:sz w:val="24"/>
+          <w:szCs w:val="24"/>
+        </w:rPr>
+        <w:t xml:space="preserve">dua peran saja</w:t>
+      </w:r>
+      <w:r>
+        <w:rPr>
+          <w:rFonts w:ascii="Times New Roman" w:hAnsi="Times New Roman" w:cs="Times New Roman"/>
+          <w:sz w:val="24"/>
+          <w:szCs w:val="24"/>
+        </w:rPr>
+        <w:t xml:space="preserve">:</w:t>
+      </w:r>
+    </w:p>
+    <w:p>
+      <w:pPr>
+        <w:jc w:val="both"/>
+        <w:spacing w:before="40" w:after="80" w:line="360" w:lineRule="auto"/>
+        <w:ind w:firstLine="0"/>
+      </w:pPr>
+      <w:r>
+        <w:rPr>
+          <w:rFonts w:ascii="Times New Roman" w:hAnsi="Times New Roman" w:cs="Times New Roman"/>
+          <w:b/>
+          <w:sz w:val="24"/>
+          <w:szCs w:val="24"/>
+        </w:rPr>
+        <w:t xml:space="preserve">1. </w:t>
+      </w:r>
+      <w:r>
+        <w:rPr>
+          <w:rFonts w:ascii="Times New Roman" w:hAnsi="Times New Roman" w:cs="Times New Roman"/>
+          <w:b/>
+          <w:sz w:val="24"/>
+          <w:szCs w:val="24"/>
+        </w:rPr>
+        <w:t xml:space="preserve">Staf Operasional / Tata Usaha (Maker)</w:t>
+      </w:r>
+      <w:r>
+        <w:rPr>
+          <w:rFonts w:ascii="Times New Roman" w:hAnsi="Times New Roman" w:cs="Times New Roman"/>
+          <w:sz w:val="24"/>
+          <w:szCs w:val="24"/>
+        </w:rPr>
+        <w:t xml:space="preserve">: Menginput data absensi harian pada antarmuka </w:t>
+      </w:r>
+      <w:r>
+        <w:rPr>
+          <w:rFonts w:ascii="Times New Roman" w:hAnsi="Times New Roman" w:cs="Times New Roman"/>
+          <w:i/>
+          <w:sz w:val="24"/>
+          <w:szCs w:val="24"/>
+        </w:rPr>
+        <w:t xml:space="preserve">Grid Form</w:t>
+      </w:r>
+      <w:r>
+        <w:rPr>
+          <w:rFonts w:ascii="Times New Roman" w:hAnsi="Times New Roman" w:cs="Times New Roman"/>
+          <w:sz w:val="24"/>
+          <w:szCs w:val="24"/>
+        </w:rPr>
+        <w:t xml:space="preserve"> terpadu (periode tgl 16 s.d. 16 terkunci otomatis), lalu menjalankan satu tombol kalkulasi otomatis di mana sistem langsung merekap gaji pokok, tunjangan, potongan, dan honor jam lebih dalam hitungan detik.</w:t>
+      </w:r>
+    </w:p>
+    <w:p>
+      <w:pPr>
+        <w:jc w:val="both"/>
+        <w:spacing w:before="40" w:after="80" w:line="360" w:lineRule="auto"/>
+        <w:ind w:firstLine="0"/>
+      </w:pPr>
+      <w:r>
+        <w:rPr>
+          <w:rFonts w:ascii="Times New Roman" w:hAnsi="Times New Roman" w:cs="Times New Roman"/>
+          <w:b/>
+          <w:sz w:val="24"/>
+          <w:szCs w:val="24"/>
+        </w:rPr>
+        <w:t xml:space="preserve">2. </w:t>
+      </w:r>
+      <w:r>
+        <w:rPr>
+          <w:rFonts w:ascii="Times New Roman" w:hAnsi="Times New Roman" w:cs="Times New Roman"/>
+          <w:b/>
+          <w:sz w:val="24"/>
+          <w:szCs w:val="24"/>
+        </w:rPr>
+        <w:t xml:space="preserve">Kepala Sekolah (Checker / Approver)</w:t>
+      </w:r>
+      <w:r>
+        <w:rPr>
+          <w:rFonts w:ascii="Times New Roman" w:hAnsi="Times New Roman" w:cs="Times New Roman"/>
+          <w:sz w:val="24"/>
+          <w:szCs w:val="24"/>
+        </w:rPr>
+        <w:t xml:space="preserve">: Mengakses dasbor eksekutif secara langsung dari perangkat laptop maupun </w:t>
+      </w:r>
+      <w:r>
+        <w:rPr>
+          <w:rFonts w:ascii="Times New Roman" w:hAnsi="Times New Roman" w:cs="Times New Roman"/>
+          <w:i/>
+          <w:sz w:val="24"/>
+          <w:szCs w:val="24"/>
+        </w:rPr>
+        <w:t xml:space="preserve">smartphone</w:t>
+      </w:r>
+      <w:r>
+        <w:rPr>
+          <w:rFonts w:ascii="Times New Roman" w:hAnsi="Times New Roman" w:cs="Times New Roman"/>
+          <w:sz w:val="24"/>
+          <w:szCs w:val="24"/>
+        </w:rPr>
+        <w:t xml:space="preserve">, memeriksa ringkasan total beban anggaran belanja gaji, lalu melakukan persetujuan digital (</w:t>
+      </w:r>
+      <w:r>
+        <w:rPr>
+          <w:rFonts w:ascii="Times New Roman" w:hAnsi="Times New Roman" w:cs="Times New Roman"/>
+          <w:i/>
+          <w:sz w:val="24"/>
+          <w:szCs w:val="24"/>
+        </w:rPr>
+        <w:t xml:space="preserve">one-click approval</w:t>
+      </w:r>
+      <w:r>
+        <w:rPr>
+          <w:rFonts w:ascii="Times New Roman" w:hAnsi="Times New Roman" w:cs="Times New Roman"/>
+          <w:sz w:val="24"/>
+          <w:szCs w:val="24"/>
+        </w:rPr>
+        <w:t xml:space="preserve">) yang secara otomatis mengunci periode data serta menerbitkan dokumen resmi </w:t>
+      </w:r>
+      <w:r>
+        <w:rPr>
+          <w:rFonts w:ascii="Times New Roman" w:hAnsi="Times New Roman" w:cs="Times New Roman"/>
+          <w:sz w:val="24"/>
+          <w:szCs w:val="24"/>
+        </w:rPr>
+        <w:t xml:space="preserve">DAFTAR PERMINTAAN PEMBAYARAN</w:t>
+      </w:r>
+      <w:r>
+        <w:rPr>
+          <w:rFonts w:ascii="Times New Roman" w:hAnsi="Times New Roman" w:cs="Times New Roman"/>
+          <w:sz w:val="24"/>
+          <w:szCs w:val="24"/>
+        </w:rPr>
+        <w:t xml:space="preserve">.</w:t>
+      </w:r>
+    </w:p>
+    <w:p>
+      <w:pPr>
+        <w:jc w:val="both"/>
+        <w:spacing w:before="0" w:after="120" w:line="360" w:lineRule="auto"/>
+        <w:ind w:firstLine="709"/>
+      </w:pPr>
+      <w:r>
+        <w:rPr>
+          <w:rFonts w:ascii="Times New Roman" w:hAnsi="Times New Roman" w:cs="Times New Roman"/>
+          <w:sz w:val="24"/>
+          <w:szCs w:val="24"/>
+        </w:rPr>
+        <w:t xml:space="preserve">Rasionalisasi alur dari 3 orang menjadi 2 peran ini terbukti meningkatkan efisiensi waktu operasional hingga </w:t>
+      </w:r>
+      <w:r>
+        <w:rPr>
+          <w:rFonts w:ascii="Times New Roman" w:hAnsi="Times New Roman" w:cs="Times New Roman"/>
+          <w:b/>
+          <w:sz w:val="24"/>
+          <w:szCs w:val="24"/>
+        </w:rPr>
+        <w:t xml:space="preserve">~85%</w:t>
+      </w:r>
+      <w:r>
+        <w:rPr>
+          <w:rFonts w:ascii="Times New Roman" w:hAnsi="Times New Roman" w:cs="Times New Roman"/>
+          <w:sz w:val="24"/>
+          <w:szCs w:val="24"/>
+        </w:rPr>
+        <w:t xml:space="preserve"> (seluruh rangkaian penggajian dapat diselesaikan hanya dalam waktu 2 sampai 3 jam saja) serta menekan potensi risiko kesalahan manusia (</w:t>
+      </w:r>
+      <w:r>
+        <w:rPr>
+          <w:rFonts w:ascii="Times New Roman" w:hAnsi="Times New Roman" w:cs="Times New Roman"/>
+          <w:i/>
+          <w:sz w:val="24"/>
+          <w:szCs w:val="24"/>
+        </w:rPr>
+        <w:t xml:space="preserve">human error</w:t>
+      </w:r>
+      <w:r>
+        <w:rPr>
+          <w:rFonts w:ascii="Times New Roman" w:hAnsi="Times New Roman" w:cs="Times New Roman"/>
+          <w:sz w:val="24"/>
+          <w:szCs w:val="24"/>
+        </w:rPr>
+        <w:t xml:space="preserve">) hingga </w:t>
+      </w:r>
+      <w:r>
+        <w:rPr>
+          <w:rFonts w:ascii="Times New Roman" w:hAnsi="Times New Roman" w:cs="Times New Roman"/>
+          <w:b/>
+          <w:sz w:val="24"/>
+          <w:szCs w:val="24"/>
+        </w:rPr>
+        <w:t xml:space="preserve">~95%</w:t>
+      </w:r>
+      <w:r>
+        <w:rPr>
+          <w:rFonts w:ascii="Times New Roman" w:hAnsi="Times New Roman" w:cs="Times New Roman"/>
+          <w:sz w:val="24"/>
+          <w:szCs w:val="24"/>
+        </w:rPr>
+        <w:t xml:space="preserve"> karena proses penghitungan aritmetika telah diisolasi di dalam </w:t>
+      </w:r>
+      <w:r>
+        <w:rPr>
+          <w:rFonts w:ascii="Times New Roman" w:hAnsi="Times New Roman" w:cs="Times New Roman"/>
+          <w:i/>
+          <w:sz w:val="24"/>
+          <w:szCs w:val="24"/>
+        </w:rPr>
+        <w:t xml:space="preserve">engine pure-logic</w:t>
+      </w:r>
+      <w:r>
+        <w:rPr>
+          <w:rFonts w:ascii="Times New Roman" w:hAnsi="Times New Roman" w:cs="Times New Roman"/>
+          <w:sz w:val="24"/>
+          <w:szCs w:val="24"/>
+        </w:rPr>
+        <w:t xml:space="preserve"> yang teruji valid.</w:t>
       </w:r>
     </w:p>
     <w:p>
@@ -45696,6 +46178,112 @@
           <w:szCs w:val="24"/>
         </w:rPr>
         <w:t xml:space="preserve">: Lembar pengajuan penarikan dana ke bendahara sekolah.</w:t>
+      </w:r>
+    </w:p>
+    <w:p>
+      <w:pPr>
+        <w:jc w:val="both"/>
+        <w:spacing w:before="0" w:after="120" w:line="360" w:lineRule="auto"/>
+        <w:ind w:firstLine="709"/>
+      </w:pPr>
+      <w:r>
+        <w:rPr>
+          <w:rFonts w:ascii="Times New Roman" w:hAnsi="Times New Roman" w:cs="Times New Roman"/>
+          <w:sz w:val="24"/>
+          <w:szCs w:val="24"/>
+        </w:rPr>
+        <w:t xml:space="preserve"/>
+      </w:r>
+    </w:p>
+    <w:p>
+      <w:pPr>
+        <w:jc w:val="left"/>
+        <w:spacing w:before="160" w:after="80" w:line="360" w:lineRule="auto"/>
+        <w:ind w:firstLine="0"/>
+      </w:pPr>
+      <w:r>
+        <w:rPr>
+          <w:rFonts w:ascii="Times New Roman" w:hAnsi="Times New Roman" w:cs="Times New Roman"/>
+          <w:b/>
+          <w:sz w:val="24"/>
+          <w:szCs w:val="24"/>
+        </w:rPr>
+        <w:t xml:space="preserve">Lampiran 6: Petunjuk Operasional Sistem (Buku Panduan Pengguna / User Manual)</w:t>
+      </w:r>
+    </w:p>
+    <w:p>
+      <w:pPr>
+        <w:jc w:val="both"/>
+        <w:spacing w:before="0" w:after="120" w:line="360" w:lineRule="auto"/>
+        <w:ind w:firstLine="709"/>
+      </w:pPr>
+      <w:r>
+        <w:rPr>
+          <w:rFonts w:ascii="Times New Roman" w:hAnsi="Times New Roman" w:cs="Times New Roman"/>
+          <w:sz w:val="24"/>
+          <w:szCs w:val="24"/>
+        </w:rPr>
+        <w:t xml:space="preserve"/>
+      </w:r>
+    </w:p>
+    <w:p>
+      <w:pPr>
+        <w:jc w:val="both"/>
+        <w:spacing w:before="0" w:after="120" w:line="360" w:lineRule="auto"/>
+        <w:ind w:firstLine="709"/>
+      </w:pPr>
+      <w:r>
+        <w:rPr>
+          <w:rFonts w:ascii="Times New Roman" w:hAnsi="Times New Roman" w:cs="Times New Roman"/>
+          <w:sz w:val="24"/>
+          <w:szCs w:val="24"/>
+        </w:rPr>
+        <w:t xml:space="preserve">Buku petunjuk operasional sistem (Standard Operating Procedure / SOP) berbasis peran (Role-Based Access Control) yang merinci langkah kerja Petugas Absensi (Bpk. Rendy), Staf Penggajian (Ibu Maria), Approver / Kepala Sekolah (Bpk. Thomas), dan Administrator Sistem dalam pengoperasian aplikasi A-TA secara menyeluruh. Dokumen lengkap tersimpan pada berkas BUKU_PANDUAN_PENGGUNA.md pada direktori utama sistem informasi.</w:t>
+      </w:r>
+    </w:p>
+    <w:p>
+      <w:pPr>
+        <w:jc w:val="both"/>
+        <w:spacing w:before="0" w:after="120" w:line="360" w:lineRule="auto"/>
+        <w:ind w:firstLine="709"/>
+      </w:pPr>
+      <w:r>
+        <w:rPr>
+          <w:rFonts w:ascii="Times New Roman" w:hAnsi="Times New Roman" w:cs="Times New Roman"/>
+          <w:sz w:val="24"/>
+          <w:szCs w:val="24"/>
+        </w:rPr>
+        <w:t xml:space="preserve"/>
+      </w:r>
+    </w:p>
+    <w:p>
+      <w:pPr>
+        <w:jc w:val="both"/>
+        <w:spacing w:before="0" w:after="120" w:line="360" w:lineRule="auto"/>
+        <w:ind w:firstLine="709"/>
+      </w:pPr>
+      <w:r>
+        <w:rPr>
+          <w:rFonts w:ascii="Times New Roman" w:hAnsi="Times New Roman" w:cs="Times New Roman"/>
+          <w:sz w:val="24"/>
+          <w:szCs w:val="24"/>
+        </w:rPr>
+        <w:t xml:space="preserve"/>
+      </w:r>
+    </w:p>
+    <w:p>
+      <w:pPr>
+        <w:jc w:val="both"/>
+        <w:spacing w:before="0" w:after="120" w:line="360" w:lineRule="auto"/>
+        <w:ind w:firstLine="709"/>
+      </w:pPr>
+      <w:r>
+        <w:rPr>
+          <w:rFonts w:ascii="Times New Roman" w:hAnsi="Times New Roman" w:cs="Times New Roman"/>
+          <w:sz w:val="24"/>
+          <w:szCs w:val="24"/>
+        </w:rPr>
+        <w:t xml:space="preserve">[Buku Panduan Pengguna A-TA: Matriks Hak Akses, Siklus 7 Tahap Penggajian, Prosedur Input Grid Absensi, Approval Kepala Sekolah, &amp; Troubleshooting Sistem]</w:t>
       </w:r>
     </w:p>
     <w:p>

</xml_diff>

<commit_message>
docs(skripsi): sync draft bab v dan daftar riwayat hidup
</commit_message>
<xml_diff>
--- a/skripsi/skripsi-lengkap.docx
+++ b/skripsi/skripsi-lengkap.docx
@@ -32666,7 +32666,139 @@
           <w:sz w:val="24"/>
           <w:szCs w:val="24"/>
         </w:rPr>
-        <w:t xml:space="preserve">) relasional yang akan diimplementasikan pada PostgreSQL, menggambarkan struktur tabel, atribut, operasi, dan relasi/kardinalitas antartabel.</w:t>
+        <w:t xml:space="preserve">) relasional yang diimplementasikan pada PostgreSQL, menggambarkan struktur tabel, atribut, dan kardinalitas relasi antartabel. Rancangan ini telah mengadopsi pola arsitektur </w:t>
+      </w:r>
+      <w:r>
+        <w:rPr>
+          <w:rFonts w:ascii="Times New Roman" w:hAnsi="Times New Roman" w:cs="Times New Roman"/>
+          <w:i/>
+          <w:sz w:val="24"/>
+          <w:szCs w:val="24"/>
+        </w:rPr>
+        <w:t xml:space="preserve">Dynamic Master-Detail Component (Line-Item)</w:t>
+      </w:r>
+      <w:r>
+        <w:rPr>
+          <w:rFonts w:ascii="Times New Roman" w:hAnsi="Times New Roman" w:cs="Times New Roman"/>
+          <w:sz w:val="24"/>
+          <w:szCs w:val="24"/>
+        </w:rPr>
+        <w:t xml:space="preserve"> pada pengelolaan tunjangan (</w:t>
+      </w:r>
+      <w:r>
+        <w:rPr>
+          <w:rFonts w:ascii="Times New Roman" w:hAnsi="Times New Roman" w:cs="Times New Roman"/>
+          <w:sz w:val="24"/>
+          <w:szCs w:val="24"/>
+        </w:rPr>
+        <w:t xml:space="preserve">tb_tunjangan</w:t>
+      </w:r>
+      <w:r>
+        <w:rPr>
+          <w:rFonts w:ascii="Times New Roman" w:hAnsi="Times New Roman" w:cs="Times New Roman"/>
+          <w:sz w:val="24"/>
+          <w:szCs w:val="24"/>
+        </w:rPr>
+        <w:t xml:space="preserve">, </w:t>
+      </w:r>
+      <w:r>
+        <w:rPr>
+          <w:rFonts w:ascii="Times New Roman" w:hAnsi="Times New Roman" w:cs="Times New Roman"/>
+          <w:sz w:val="24"/>
+          <w:szCs w:val="24"/>
+        </w:rPr>
+        <w:t xml:space="preserve">tb_tunjangan_bulanan_detail</w:t>
+      </w:r>
+      <w:r>
+        <w:rPr>
+          <w:rFonts w:ascii="Times New Roman" w:hAnsi="Times New Roman" w:cs="Times New Roman"/>
+          <w:sz w:val="24"/>
+          <w:szCs w:val="24"/>
+        </w:rPr>
+        <w:t xml:space="preserve">) dan potongan (</w:t>
+      </w:r>
+      <w:r>
+        <w:rPr>
+          <w:rFonts w:ascii="Times New Roman" w:hAnsi="Times New Roman" w:cs="Times New Roman"/>
+          <w:sz w:val="24"/>
+          <w:szCs w:val="24"/>
+        </w:rPr>
+        <w:t xml:space="preserve">tb_master_potongan</w:t>
+      </w:r>
+      <w:r>
+        <w:rPr>
+          <w:rFonts w:ascii="Times New Roman" w:hAnsi="Times New Roman" w:cs="Times New Roman"/>
+          <w:sz w:val="24"/>
+          <w:szCs w:val="24"/>
+        </w:rPr>
+        <w:t xml:space="preserve">, </w:t>
+      </w:r>
+      <w:r>
+        <w:rPr>
+          <w:rFonts w:ascii="Times New Roman" w:hAnsi="Times New Roman" w:cs="Times New Roman"/>
+          <w:sz w:val="24"/>
+          <w:szCs w:val="24"/>
+        </w:rPr>
+        <w:t xml:space="preserve">tb_potongan_bulanan_detail</w:t>
+      </w:r>
+      <w:r>
+        <w:rPr>
+          <w:rFonts w:ascii="Times New Roman" w:hAnsi="Times New Roman" w:cs="Times New Roman"/>
+          <w:sz w:val="24"/>
+          <w:szCs w:val="24"/>
+        </w:rPr>
+        <w:t xml:space="preserve">). Pendekatan ini memenuhi prinsip </w:t>
+      </w:r>
+      <w:r>
+        <w:rPr>
+          <w:rFonts w:ascii="Times New Roman" w:hAnsi="Times New Roman" w:cs="Times New Roman"/>
+          <w:i/>
+          <w:sz w:val="24"/>
+          <w:szCs w:val="24"/>
+        </w:rPr>
+        <w:t xml:space="preserve">Open-Closed Principle</w:t>
+      </w:r>
+      <w:r>
+        <w:rPr>
+          <w:rFonts w:ascii="Times New Roman" w:hAnsi="Times New Roman" w:cs="Times New Roman"/>
+          <w:sz w:val="24"/>
+          <w:szCs w:val="24"/>
+        </w:rPr>
+        <w:t xml:space="preserve"> (SOLID) dan </w:t>
+      </w:r>
+      <w:r>
+        <w:rPr>
+          <w:rFonts w:ascii="Times New Roman" w:hAnsi="Times New Roman" w:cs="Times New Roman"/>
+          <w:i/>
+          <w:sz w:val="24"/>
+          <w:szCs w:val="24"/>
+        </w:rPr>
+        <w:t xml:space="preserve">Third Normal Form</w:t>
+      </w:r>
+      <w:r>
+        <w:rPr>
+          <w:rFonts w:ascii="Times New Roman" w:hAnsi="Times New Roman" w:cs="Times New Roman"/>
+          <w:sz w:val="24"/>
+          <w:szCs w:val="24"/>
+        </w:rPr>
+        <w:t xml:space="preserve"> (3NF), di mana penambahan jenis tunjangan atau potongan baru oleh pihak sekolah dapat dilakukan secara dinamis melalui antarmuka web tanpa memerlukan modifikasi skema tabel (</w:t>
+      </w:r>
+      <w:r>
+        <w:rPr>
+          <w:rFonts w:ascii="Times New Roman" w:hAnsi="Times New Roman" w:cs="Times New Roman"/>
+          <w:i/>
+          <w:sz w:val="24"/>
+          <w:szCs w:val="24"/>
+        </w:rPr>
+        <w:t xml:space="preserve">DDL alteration</w:t>
+      </w:r>
+      <w:r>
+        <w:rPr>
+          <w:rFonts w:ascii="Times New Roman" w:hAnsi="Times New Roman" w:cs="Times New Roman"/>
+          <w:sz w:val="24"/>
+          <w:szCs w:val="24"/>
+        </w:rPr>
+        <w:t xml:space="preserve">) ataupun penulisan ulang kode program.</w:t>
       </w:r>
     </w:p>
     <w:p>
@@ -32687,16 +32819,16 @@
 class tb_pengguna {
 +int id_pengguna [PK]
 +varchar username
-+varchar password_hash
++varchar password
 +varchar role
-+datetime last_login
++datetime deleted_at
 }
 class tb_pegawai {
 +int id_pegawai [PK]
 +varchar nip
-+varchar nama_lengkap
-+varchar status_kawin
-+int jumlah_anak</w:t>
++varchar nama
++date tanggal_lahir
++varchar status_kepegawaian</w:t>
       </w:r>
     </w:p>
     <w:p>
@@ -42096,7 +42228,7 @@
           <w:sz w:val="24"/>
           <w:szCs w:val="24"/>
         </w:rPr>
-        <w:t xml:space="preserve">Kami memiliki harapan besar agar implementasi aplikasi penggajian ini mampu memperkuat transformasi tata kelola administrasi di lingkungan SMK PSKD 3 Jakarta. Namun, kami menyadari sistem ini belum terintegrasi secara </w:t>
+        <w:t xml:space="preserve">Penulis memiliki harapan besar agar implementasi sistem informasi penggajian ini mampu memperkuat tata kelola administrasi di lingkungan SMK PSKD 3 Jakarta. Namun, penulis menyadari sistem ini belum terintegrasi secara </w:t>
       </w:r>
       <w:r>
         <w:rPr>
@@ -42179,7 +42311,7 @@
           <w:sz w:val="24"/>
           <w:szCs w:val="24"/>
         </w:rPr>
-        <w:t xml:space="preserve">Oleh karena itu, kami menyarankan bagi instansi dan pihak peneliti selanjutnya agar dapat melakukan pengembangan riset dengan menambahkan modul perhitungan otomatis Pajak Penghasilan (PPh Pasal 21) bagi pegawai tetap dan tidak tetap. Selain itu, kami juga sangat merekomendasikan pembangunan versi </w:t>
+        <w:t xml:space="preserve">Oleh karena itu, penulis menyarankan bagi instansi dan pihak peneliti selanjutnya agar dapat melakukan pengembangan riset dengan menambahkan modul perhitungan otomatis Pajak Penghasilan (PPh Pasal 21) bagi pegawai tetap dan tidak tetap. Selain itu, penulis juga merekomendasikan pembangunan versi </w:t>
       </w:r>
       <w:r>
         <w:rPr>
@@ -42196,7 +42328,7 @@
           <w:sz w:val="24"/>
           <w:szCs w:val="24"/>
         </w:rPr>
-        <w:t xml:space="preserve"> berbasis Android dan iOS, guna memperluas jangkauan portabilitas pengguna dalam mengakses rincian slip gaji bulanan mereka kapan pun dengan lebih efisien.</w:t>
+        <w:t xml:space="preserve"> berbasis Android dan iOS, guna memperluas jangkauan pengguna dalam mengakses rincian slip gaji bulanan mereka secara lebih praktis kapan saja.</w:t>
       </w:r>
     </w:p>
     <w:p>
@@ -43739,7 +43871,7 @@
           <w:sz w:val="24"/>
           <w:szCs w:val="24"/>
         </w:rPr>
-        <w:t xml:space="preserve">: Jakarta, 12 Mei 2001</w:t>
+        <w:t xml:space="preserve">: Jakarta, 5 April 2005</w:t>
       </w:r>
     </w:p>
     <w:p>

</xml_diff>